<commit_message>
simulation/paper: drop "Pre-Registered" qualifier from title
Putting "Pre-Registered" in the title is performative and slightly
overstates the registration scope: the N = 354 dataset is a secondary-
analysis input that was collected before the OSF v2.0 registration,
so the registration covers the analysis pipeline rather than the data
collection. The OSF DOI on the title page and the Reporting-standard
line ("Stage 2 Registered Report ... following the v2.0 pre-
registration") communicate the registration cleanly without title-
level branding.

New title (applied to build_docx.py TITLE constant, 01_intro.md,
cover_letter_socarxiv.md, and title_candidates.md):

  Person-Level versus System-Level Anti-Harassment Interventions:
  A HEXACO 7-Typology Counterfactual Microsimulation in Japanese
  Workplaces

Manuscript and split-body docx regenerated from the updated build
script and markdown sources.
</commit_message>
<xml_diff>
--- a/simulation/paper/split/03_tables.docx
+++ b/simulation/paper/split/03_tables.docx
@@ -13,7 +13,7 @@
           <w:b/>
           <w:sz w:val="24"/>
         </w:rPr>
-        <w:t>Person-Level versus System-Level Anti-Harassment Interventions: HEXACO 7-Typology Evidence That Structure Dominates Personality in Japanese Workplaces</w:t>
+        <w:t>Person-Level versus System-Level Anti-Harassment Interventions: A HEXACO 7-Typology Counterfactual Microsimulation in Japanese Workplaces</w:t>
       </w:r>
     </w:p>
     <w:p>
@@ -3527,7 +3527,7 @@
         <w:b w:val="0"/>
         <w:sz w:val="24"/>
       </w:rPr>
-      <w:t>STRUCTURE DOMINATES PERSONALITY</w:t>
+      <w:t>HEXACO COUNTERFACTUAL MICROSIMULATION</w:t>
     </w:r>
     <w:r>
       <w:rPr>

</xml_diff>